<commit_message>
docs(evidence): update English testing results
</commit_message>
<xml_diff>
--- a/06_DOCUMENTACION_DE_PRUEBAS/EN/WORD/06_Testing_Documentation.docx
+++ b/06_DOCUMENTACION_DE_PRUEBAS/EN/WORD/06_Testing_Documentation.docx
@@ -571,7 +571,7 @@
           <w:kern w:val="2"/>
           <w:sz w:val="24"/>
           <w:szCs w:val="24"/>
-          <w:lang w:val="es-CO"/>
+          <w:lang w:val="es-419" w:eastAsia="es-419"/>
           <w14:ligatures w14:val="standardContextual"/>
         </w:rPr>
       </w:pPr>
@@ -593,7 +593,7 @@
         </w:rPr>
         <w:fldChar w:fldCharType="separate"/>
       </w:r>
-      <w:hyperlink w:anchor="_Toc242459452" w:history="1">
+      <w:hyperlink w:anchor="_Toc243049490" w:history="1">
         <w:r>
           <w:rPr>
             <w:rStyle w:val="Hipervnculo"/>
@@ -621,7 +621,7 @@
             <w:noProof/>
             <w:webHidden/>
           </w:rPr>
-          <w:instrText xml:space="preserve"> PAGEREF _Toc242459452 \h </w:instrText>
+          <w:instrText xml:space="preserve"> PAGEREF _Toc243049490 \h </w:instrText>
         </w:r>
         <w:r>
           <w:rPr>
@@ -665,11 +665,11 @@
           <w:kern w:val="2"/>
           <w:sz w:val="24"/>
           <w:szCs w:val="24"/>
-          <w:lang w:val="es-CO"/>
+          <w:lang w:val="es-419" w:eastAsia="es-419"/>
           <w14:ligatures w14:val="standardContextual"/>
         </w:rPr>
       </w:pPr>
-      <w:hyperlink w:anchor="_Toc242459453" w:history="1">
+      <w:hyperlink w:anchor="_Toc243049491" w:history="1">
         <w:r>
           <w:rPr>
             <w:rStyle w:val="Hipervnculo"/>
@@ -697,7 +697,7 @@
             <w:noProof/>
             <w:webHidden/>
           </w:rPr>
-          <w:instrText xml:space="preserve"> PAGEREF _Toc242459453 \h </w:instrText>
+          <w:instrText xml:space="preserve"> PAGEREF _Toc243049491 \h </w:instrText>
         </w:r>
         <w:r>
           <w:rPr>
@@ -741,11 +741,11 @@
           <w:kern w:val="2"/>
           <w:sz w:val="24"/>
           <w:szCs w:val="24"/>
-          <w:lang w:val="es-CO"/>
+          <w:lang w:val="es-419" w:eastAsia="es-419"/>
           <w14:ligatures w14:val="standardContextual"/>
         </w:rPr>
       </w:pPr>
-      <w:hyperlink w:anchor="_Toc242459454" w:history="1">
+      <w:hyperlink w:anchor="_Toc243049492" w:history="1">
         <w:r>
           <w:rPr>
             <w:rStyle w:val="Hipervnculo"/>
@@ -773,7 +773,7 @@
             <w:noProof/>
             <w:webHidden/>
           </w:rPr>
-          <w:instrText xml:space="preserve"> PAGEREF _Toc242459454 \h </w:instrText>
+          <w:instrText xml:space="preserve"> PAGEREF _Toc243049492 \h </w:instrText>
         </w:r>
         <w:r>
           <w:rPr>
@@ -817,11 +817,11 @@
           <w:kern w:val="2"/>
           <w:sz w:val="24"/>
           <w:szCs w:val="24"/>
-          <w:lang w:val="es-CO"/>
+          <w:lang w:val="es-419" w:eastAsia="es-419"/>
           <w14:ligatures w14:val="standardContextual"/>
         </w:rPr>
       </w:pPr>
-      <w:hyperlink w:anchor="_Toc242459455" w:history="1">
+      <w:hyperlink w:anchor="_Toc243049493" w:history="1">
         <w:r>
           <w:rPr>
             <w:rStyle w:val="Hipervnculo"/>
@@ -849,7 +849,7 @@
             <w:noProof/>
             <w:webHidden/>
           </w:rPr>
-          <w:instrText xml:space="preserve"> PAGEREF _Toc242459455 \h </w:instrText>
+          <w:instrText xml:space="preserve"> PAGEREF _Toc243049493 \h </w:instrText>
         </w:r>
         <w:r>
           <w:rPr>
@@ -893,11 +893,11 @@
           <w:kern w:val="2"/>
           <w:sz w:val="24"/>
           <w:szCs w:val="24"/>
-          <w:lang w:val="es-CO"/>
+          <w:lang w:val="es-419" w:eastAsia="es-419"/>
           <w14:ligatures w14:val="standardContextual"/>
         </w:rPr>
       </w:pPr>
-      <w:hyperlink w:anchor="_Toc242459456" w:history="1">
+      <w:hyperlink w:anchor="_Toc243049494" w:history="1">
         <w:r>
           <w:rPr>
             <w:rStyle w:val="Hipervnculo"/>
@@ -925,7 +925,7 @@
             <w:noProof/>
             <w:webHidden/>
           </w:rPr>
-          <w:instrText xml:space="preserve"> PAGEREF _Toc242459456 \h </w:instrText>
+          <w:instrText xml:space="preserve"> PAGEREF _Toc243049494 \h </w:instrText>
         </w:r>
         <w:r>
           <w:rPr>
@@ -969,11 +969,11 @@
           <w:kern w:val="2"/>
           <w:sz w:val="24"/>
           <w:szCs w:val="24"/>
-          <w:lang w:val="es-CO"/>
+          <w:lang w:val="es-419" w:eastAsia="es-419"/>
           <w14:ligatures w14:val="standardContextual"/>
         </w:rPr>
       </w:pPr>
-      <w:hyperlink w:anchor="_Toc242459457" w:history="1">
+      <w:hyperlink w:anchor="_Toc243049495" w:history="1">
         <w:r>
           <w:rPr>
             <w:rStyle w:val="Hipervnculo"/>
@@ -1001,7 +1001,7 @@
             <w:noProof/>
             <w:webHidden/>
           </w:rPr>
-          <w:instrText xml:space="preserve"> PAGEREF _Toc242459457 \h </w:instrText>
+          <w:instrText xml:space="preserve"> PAGEREF _Toc243049495 \h </w:instrText>
         </w:r>
         <w:r>
           <w:rPr>
@@ -1045,11 +1045,11 @@
           <w:kern w:val="2"/>
           <w:sz w:val="24"/>
           <w:szCs w:val="24"/>
-          <w:lang w:val="es-CO"/>
+          <w:lang w:val="es-419" w:eastAsia="es-419"/>
           <w14:ligatures w14:val="standardContextual"/>
         </w:rPr>
       </w:pPr>
-      <w:hyperlink w:anchor="_Toc242459458" w:history="1">
+      <w:hyperlink w:anchor="_Toc243049496" w:history="1">
         <w:r>
           <w:rPr>
             <w:rStyle w:val="Hipervnculo"/>
@@ -1077,7 +1077,7 @@
             <w:noProof/>
             <w:webHidden/>
           </w:rPr>
-          <w:instrText xml:space="preserve"> PAGEREF _Toc242459458 \h </w:instrText>
+          <w:instrText xml:space="preserve"> PAGEREF _Toc243049496 \h </w:instrText>
         </w:r>
         <w:r>
           <w:rPr>
@@ -1121,11 +1121,11 @@
           <w:kern w:val="2"/>
           <w:sz w:val="24"/>
           <w:szCs w:val="24"/>
-          <w:lang w:val="es-CO"/>
+          <w:lang w:val="es-419" w:eastAsia="es-419"/>
           <w14:ligatures w14:val="standardContextual"/>
         </w:rPr>
       </w:pPr>
-      <w:hyperlink w:anchor="_Toc242459459" w:history="1">
+      <w:hyperlink w:anchor="_Toc243049497" w:history="1">
         <w:r>
           <w:rPr>
             <w:rStyle w:val="Hipervnculo"/>
@@ -1153,7 +1153,7 @@
             <w:noProof/>
             <w:webHidden/>
           </w:rPr>
-          <w:instrText xml:space="preserve"> PAGEREF _Toc242459459 \h </w:instrText>
+          <w:instrText xml:space="preserve"> PAGEREF _Toc243049497 \h </w:instrText>
         </w:r>
         <w:r>
           <w:rPr>
@@ -1197,11 +1197,11 @@
           <w:kern w:val="2"/>
           <w:sz w:val="24"/>
           <w:szCs w:val="24"/>
-          <w:lang w:val="es-CO"/>
+          <w:lang w:val="es-419" w:eastAsia="es-419"/>
           <w14:ligatures w14:val="standardContextual"/>
         </w:rPr>
       </w:pPr>
-      <w:hyperlink w:anchor="_Toc242459460" w:history="1">
+      <w:hyperlink w:anchor="_Toc243049498" w:history="1">
         <w:r>
           <w:rPr>
             <w:rStyle w:val="Hipervnculo"/>
@@ -1229,7 +1229,7 @@
             <w:noProof/>
             <w:webHidden/>
           </w:rPr>
-          <w:instrText xml:space="preserve"> PAGEREF _Toc242459460 \h </w:instrText>
+          <w:instrText xml:space="preserve"> PAGEREF _Toc243049498 \h </w:instrText>
         </w:r>
         <w:r>
           <w:rPr>
@@ -1273,11 +1273,11 @@
           <w:kern w:val="2"/>
           <w:sz w:val="24"/>
           <w:szCs w:val="24"/>
-          <w:lang w:val="es-CO"/>
+          <w:lang w:val="es-419" w:eastAsia="es-419"/>
           <w14:ligatures w14:val="standardContextual"/>
         </w:rPr>
       </w:pPr>
-      <w:hyperlink w:anchor="_Toc242459461" w:history="1">
+      <w:hyperlink w:anchor="_Toc243049499" w:history="1">
         <w:r>
           <w:rPr>
             <w:rStyle w:val="Hipervnculo"/>
@@ -1305,7 +1305,7 @@
             <w:noProof/>
             <w:webHidden/>
           </w:rPr>
-          <w:instrText xml:space="preserve"> PAGEREF _Toc242459461 \h </w:instrText>
+          <w:instrText xml:space="preserve"> PAGEREF _Toc243049499 \h </w:instrText>
         </w:r>
         <w:r>
           <w:rPr>
@@ -1349,11 +1349,11 @@
           <w:kern w:val="2"/>
           <w:sz w:val="24"/>
           <w:szCs w:val="24"/>
-          <w:lang w:val="es-CO"/>
+          <w:lang w:val="es-419" w:eastAsia="es-419"/>
           <w14:ligatures w14:val="standardContextual"/>
         </w:rPr>
       </w:pPr>
-      <w:hyperlink w:anchor="_Toc242459462" w:history="1">
+      <w:hyperlink w:anchor="_Toc243049500" w:history="1">
         <w:r>
           <w:rPr>
             <w:rStyle w:val="Hipervnculo"/>
@@ -1381,7 +1381,7 @@
             <w:noProof/>
             <w:webHidden/>
           </w:rPr>
-          <w:instrText xml:space="preserve"> PAGEREF _Toc242459462 \h </w:instrText>
+          <w:instrText xml:space="preserve"> PAGEREF _Toc243049500 \h </w:instrText>
         </w:r>
         <w:r>
           <w:rPr>
@@ -1401,7 +1401,7 @@
             <w:noProof/>
             <w:webHidden/>
           </w:rPr>
-          <w:t>5</w:t>
+          <w:t>6</w:t>
         </w:r>
         <w:r>
           <w:rPr>
@@ -1425,11 +1425,11 @@
           <w:kern w:val="2"/>
           <w:sz w:val="24"/>
           <w:szCs w:val="24"/>
-          <w:lang w:val="es-CO"/>
+          <w:lang w:val="es-419" w:eastAsia="es-419"/>
           <w14:ligatures w14:val="standardContextual"/>
         </w:rPr>
       </w:pPr>
-      <w:hyperlink w:anchor="_Toc242459463" w:history="1">
+      <w:hyperlink w:anchor="_Toc243049501" w:history="1">
         <w:r>
           <w:rPr>
             <w:rStyle w:val="Hipervnculo"/>
@@ -1457,7 +1457,7 @@
             <w:noProof/>
             <w:webHidden/>
           </w:rPr>
-          <w:instrText xml:space="preserve"> PAGEREF _Toc242459463 \h </w:instrText>
+          <w:instrText xml:space="preserve"> PAGEREF _Toc243049501 \h </w:instrText>
         </w:r>
         <w:r>
           <w:rPr>
@@ -1501,11 +1501,11 @@
           <w:kern w:val="2"/>
           <w:sz w:val="24"/>
           <w:szCs w:val="24"/>
-          <w:lang w:val="es-CO"/>
+          <w:lang w:val="es-419" w:eastAsia="es-419"/>
           <w14:ligatures w14:val="standardContextual"/>
         </w:rPr>
       </w:pPr>
-      <w:hyperlink w:anchor="_Toc242459464" w:history="1">
+      <w:hyperlink w:anchor="_Toc243049502" w:history="1">
         <w:r>
           <w:rPr>
             <w:rStyle w:val="Hipervnculo"/>
@@ -1533,83 +1533,7 @@
             <w:noProof/>
             <w:webHidden/>
           </w:rPr>
-          <w:instrText xml:space="preserve"> PAGEREF _Toc242459464 \h </w:instrText>
-        </w:r>
-        <w:r>
-          <w:rPr>
-            <w:noProof/>
-            <w:webHidden/>
-          </w:rPr>
-        </w:r>
-        <w:r>
-          <w:rPr>
-            <w:noProof/>
-            <w:webHidden/>
-          </w:rPr>
-          <w:fldChar w:fldCharType="separate"/>
-        </w:r>
-        <w:r>
-          <w:rPr>
-            <w:noProof/>
-            <w:webHidden/>
-          </w:rPr>
-          <w:t>7</w:t>
-        </w:r>
-        <w:r>
-          <w:rPr>
-            <w:noProof/>
-            <w:webHidden/>
-          </w:rPr>
-          <w:fldChar w:fldCharType="end"/>
-        </w:r>
-      </w:hyperlink>
-    </w:p>
-    <w:p>
-      <w:pPr>
-        <w:pStyle w:val="TDC1"/>
-        <w:tabs>
-          <w:tab w:val="right" w:leader="dot" w:pos="9350"/>
-        </w:tabs>
-        <w:rPr>
-          <w:rFonts w:asciiTheme="minorHAnsi" w:eastAsiaTheme="minorEastAsia" w:hAnsiTheme="minorHAnsi" w:cstheme="minorBidi"/>
-          <w:noProof/>
-          <w:color w:val="auto"/>
-          <w:kern w:val="2"/>
-          <w:sz w:val="24"/>
-          <w:szCs w:val="24"/>
-          <w:lang w:val="es-CO"/>
-          <w14:ligatures w14:val="standardContextual"/>
-        </w:rPr>
-      </w:pPr>
-      <w:hyperlink w:anchor="_Toc242459465" w:history="1">
-        <w:r>
-          <w:rPr>
-            <w:rStyle w:val="Hipervnculo"/>
-            <w:noProof/>
-            <w:lang w:val="en-US"/>
-          </w:rPr>
-          <w:t>Defects found</w:t>
-        </w:r>
-        <w:r>
-          <w:rPr>
-            <w:noProof/>
-            <w:webHidden/>
-          </w:rPr>
-          <w:tab/>
-        </w:r>
-        <w:r>
-          <w:rPr>
-            <w:noProof/>
-            <w:webHidden/>
-          </w:rPr>
-          <w:fldChar w:fldCharType="begin"/>
-        </w:r>
-        <w:r>
-          <w:rPr>
-            <w:noProof/>
-            <w:webHidden/>
-          </w:rPr>
-          <w:instrText xml:space="preserve"> PAGEREF _Toc242459465 \h </w:instrText>
+          <w:instrText xml:space="preserve"> PAGEREF _Toc243049502 \h </w:instrText>
         </w:r>
         <w:r>
           <w:rPr>
@@ -1653,18 +1577,18 @@
           <w:kern w:val="2"/>
           <w:sz w:val="24"/>
           <w:szCs w:val="24"/>
-          <w:lang w:val="es-CO"/>
+          <w:lang w:val="es-419" w:eastAsia="es-419"/>
           <w14:ligatures w14:val="standardContextual"/>
         </w:rPr>
       </w:pPr>
-      <w:hyperlink w:anchor="_Toc242459466" w:history="1">
+      <w:hyperlink w:anchor="_Toc243049503" w:history="1">
         <w:r>
           <w:rPr>
             <w:rStyle w:val="Hipervnculo"/>
             <w:noProof/>
             <w:lang w:val="en-US"/>
           </w:rPr>
-          <w:t>Conclusions</w:t>
+          <w:t>Defects found</w:t>
         </w:r>
         <w:r>
           <w:rPr>
@@ -1685,7 +1609,7 @@
             <w:noProof/>
             <w:webHidden/>
           </w:rPr>
-          <w:instrText xml:space="preserve"> PAGEREF _Toc242459466 \h </w:instrText>
+          <w:instrText xml:space="preserve"> PAGEREF _Toc243049503 \h </w:instrText>
         </w:r>
         <w:r>
           <w:rPr>
@@ -1729,18 +1653,18 @@
           <w:kern w:val="2"/>
           <w:sz w:val="24"/>
           <w:szCs w:val="24"/>
-          <w:lang w:val="es-CO"/>
+          <w:lang w:val="es-419" w:eastAsia="es-419"/>
           <w14:ligatures w14:val="standardContextual"/>
         </w:rPr>
       </w:pPr>
-      <w:hyperlink w:anchor="_Toc242459467" w:history="1">
+      <w:hyperlink w:anchor="_Toc243049504" w:history="1">
         <w:r>
           <w:rPr>
             <w:rStyle w:val="Hipervnculo"/>
             <w:noProof/>
             <w:lang w:val="en-US"/>
           </w:rPr>
-          <w:t>References</w:t>
+          <w:t>Conclusions</w:t>
         </w:r>
         <w:r>
           <w:rPr>
@@ -1761,7 +1685,7 @@
             <w:noProof/>
             <w:webHidden/>
           </w:rPr>
-          <w:instrText xml:space="preserve"> PAGEREF _Toc242459467 \h </w:instrText>
+          <w:instrText xml:space="preserve"> PAGEREF _Toc243049504 \h </w:instrText>
         </w:r>
         <w:r>
           <w:rPr>
@@ -1794,6 +1718,82 @@
     </w:p>
     <w:p>
       <w:pPr>
+        <w:pStyle w:val="TDC1"/>
+        <w:tabs>
+          <w:tab w:val="right" w:leader="dot" w:pos="9350"/>
+        </w:tabs>
+        <w:rPr>
+          <w:rFonts w:asciiTheme="minorHAnsi" w:eastAsiaTheme="minorEastAsia" w:hAnsiTheme="minorHAnsi" w:cstheme="minorBidi"/>
+          <w:noProof/>
+          <w:color w:val="auto"/>
+          <w:kern w:val="2"/>
+          <w:sz w:val="24"/>
+          <w:szCs w:val="24"/>
+          <w:lang w:val="es-419" w:eastAsia="es-419"/>
+          <w14:ligatures w14:val="standardContextual"/>
+        </w:rPr>
+      </w:pPr>
+      <w:hyperlink w:anchor="_Toc243049505" w:history="1">
+        <w:r>
+          <w:rPr>
+            <w:rStyle w:val="Hipervnculo"/>
+            <w:noProof/>
+            <w:lang w:val="en-US"/>
+          </w:rPr>
+          <w:t>References</w:t>
+        </w:r>
+        <w:r>
+          <w:rPr>
+            <w:noProof/>
+            <w:webHidden/>
+          </w:rPr>
+          <w:tab/>
+        </w:r>
+        <w:r>
+          <w:rPr>
+            <w:noProof/>
+            <w:webHidden/>
+          </w:rPr>
+          <w:fldChar w:fldCharType="begin"/>
+        </w:r>
+        <w:r>
+          <w:rPr>
+            <w:noProof/>
+            <w:webHidden/>
+          </w:rPr>
+          <w:instrText xml:space="preserve"> PAGEREF _Toc243049505 \h </w:instrText>
+        </w:r>
+        <w:r>
+          <w:rPr>
+            <w:noProof/>
+            <w:webHidden/>
+          </w:rPr>
+        </w:r>
+        <w:r>
+          <w:rPr>
+            <w:noProof/>
+            <w:webHidden/>
+          </w:rPr>
+          <w:fldChar w:fldCharType="separate"/>
+        </w:r>
+        <w:r>
+          <w:rPr>
+            <w:noProof/>
+            <w:webHidden/>
+          </w:rPr>
+          <w:t>10</w:t>
+        </w:r>
+        <w:r>
+          <w:rPr>
+            <w:noProof/>
+            <w:webHidden/>
+          </w:rPr>
+          <w:fldChar w:fldCharType="end"/>
+        </w:r>
+      </w:hyperlink>
+    </w:p>
+    <w:p>
+      <w:pPr>
         <w:rPr>
           <w:lang w:val="en-US"/>
         </w:rPr>
@@ -1825,7 +1825,7 @@
           <w:lang w:val="en-US"/>
         </w:rPr>
       </w:pPr>
-      <w:bookmarkStart w:id="0" w:name="_Toc242459452"/>
+      <w:bookmarkStart w:id="0" w:name="_Toc243049490"/>
       <w:r>
         <w:rPr>
           <w:lang w:val="en-US"/>
@@ -1870,7 +1870,7 @@
           <w:lang w:val="en-US"/>
         </w:rPr>
       </w:pPr>
-      <w:bookmarkStart w:id="1" w:name="_Toc242459453"/>
+      <w:bookmarkStart w:id="1" w:name="_Toc243049491"/>
       <w:r>
         <w:rPr>
           <w:lang w:val="en-US"/>
@@ -1962,7 +1962,7 @@
           <w:lang w:val="en-US"/>
         </w:rPr>
       </w:pPr>
-      <w:bookmarkStart w:id="2" w:name="_Toc242459454"/>
+      <w:bookmarkStart w:id="2" w:name="_Toc243049492"/>
       <w:r>
         <w:rPr>
           <w:lang w:val="en-US"/>
@@ -2188,7 +2188,7 @@
               <w:rPr>
                 <w:lang w:val="en-US"/>
               </w:rPr>
-              <w:t>node:test (Node.js 20)</w:t>
+              <w:t>node:test (backend); Jest + jest-expo (frontend)</w:t>
             </w:r>
           </w:p>
         </w:tc>
@@ -2721,7 +2721,7 @@
           <w:lang w:val="en-US"/>
         </w:rPr>
       </w:pPr>
-      <w:bookmarkStart w:id="3" w:name="_Toc242459455"/>
+      <w:bookmarkStart w:id="3" w:name="_Toc243049493"/>
       <w:r>
         <w:rPr>
           <w:lang w:val="en-US"/>
@@ -2737,7 +2737,7 @@
           <w:lang w:val="en-US"/>
         </w:rPr>
       </w:pPr>
-      <w:bookmarkStart w:id="4" w:name="_Toc242459456"/>
+      <w:bookmarkStart w:id="4" w:name="_Toc243049494"/>
       <w:r>
         <w:rPr>
           <w:lang w:val="en-US"/>
@@ -2762,7 +2762,7 @@
         <w:rPr>
           <w:lang w:val="en-US"/>
         </w:rPr>
-        <w:t>api-gateway and the five microservices (branch feat/microservices-split, commit 5a91e66).</w:t>
+        <w:t>api-gateway and the five microservices (branch develop, commit 2993301).</w:t>
       </w:r>
     </w:p>
     <w:p>
@@ -2800,7 +2800,7 @@
         <w:rPr>
           <w:lang w:val="en-US"/>
         </w:rPr>
-        <w:t>Client application on Android and in a desktop browser.</w:t>
+        <w:t>Client application on Android and in a desktop browser, with unit tests for its logic: validations, API client, authentication flows, and recognition (branch chore/frontend-unit-tests).</w:t>
       </w:r>
     </w:p>
     <w:p>
@@ -2810,7 +2810,7 @@
           <w:lang w:val="en-US"/>
         </w:rPr>
       </w:pPr>
-      <w:bookmarkStart w:id="5" w:name="_Toc242459457"/>
+      <w:bookmarkStart w:id="5" w:name="_Toc243049495"/>
       <w:r>
         <w:rPr>
           <w:lang w:val="en-US"/>
@@ -2835,7 +2835,7 @@
         <w:rPr>
           <w:lang w:val="en-US"/>
         </w:rPr>
-        <w:t>Load tests on a production server (does not exist yet).</w:t>
+        <w:t>Load tests on the production server (traducesenas.tech), so as not to affect users.</w:t>
       </w:r>
     </w:p>
     <w:p>
@@ -2883,7 +2883,7 @@
           <w:lang w:val="en-US"/>
         </w:rPr>
       </w:pPr>
-      <w:bookmarkStart w:id="6" w:name="_Toc242459458"/>
+      <w:bookmarkStart w:id="6" w:name="_Toc243049496"/>
       <w:r>
         <w:rPr>
           <w:lang w:val="en-US"/>
@@ -3187,7 +3187,7 @@
           <w:lang w:val="en-US"/>
         </w:rPr>
       </w:pPr>
-      <w:bookmarkStart w:id="7" w:name="_Toc242459459"/>
+      <w:bookmarkStart w:id="7" w:name="_Toc243049497"/>
       <w:r>
         <w:rPr>
           <w:lang w:val="en-US"/>
@@ -3281,7 +3281,7 @@
           <w:lang w:val="en-US"/>
         </w:rPr>
       </w:pPr>
-      <w:bookmarkStart w:id="8" w:name="_Toc242459460"/>
+      <w:bookmarkStart w:id="8" w:name="_Toc243049498"/>
       <w:r>
         <w:rPr>
           <w:lang w:val="en-US"/>
@@ -3620,7 +3620,7 @@
           <w:lang w:val="en-US"/>
         </w:rPr>
       </w:pPr>
-      <w:bookmarkStart w:id="9" w:name="_Toc242459461"/>
+      <w:bookmarkStart w:id="9" w:name="_Toc243049499"/>
       <w:r>
         <w:rPr>
           <w:lang w:val="en-US"/>
@@ -3640,7 +3640,7 @@
         <w:rPr>
           <w:lang w:val="en-US"/>
         </w:rPr>
-        <w:t>The automated backend suite was run with “npm test”, which builds the shared package and runs the tests of all services with the native Node.js test runner. The result was as follows:</w:t>
+        <w:t>The automated suites were run with “npm test” in each repository. In the backend, the command builds the shared package and runs the tests of all services with the native Node.js test runner; in the frontend, it runs Jest with the Expo preset (jest-expo). The result was as follows:</w:t>
       </w:r>
     </w:p>
     <w:p>
@@ -3676,13 +3676,13 @@
           <w:i/>
           <w:lang w:val="en-US"/>
         </w:rPr>
-        <w:t>Summary of the automated run of October 7, 2026</w:t>
+        <w:t>Summary of the automated run of October 16, 2026</w:t>
       </w:r>
     </w:p>
     <w:tbl>
       <w:tblPr>
         <w:tblStyle w:val="Tablaconcuadrcula"/>
-        <w:tblW w:w="0" w:type="auto"/>
+        <w:tblW w:w="5005" w:type="pct"/>
         <w:jc w:val="center"/>
         <w:tblInd w:w="0" w:type="dxa"/>
         <w:tblBorders>
@@ -3693,11 +3693,13 @@
           <w:insideH w:val="single" w:sz="4" w:space="0" w:color="000000"/>
           <w:insideV w:val="single" w:sz="4" w:space="0" w:color="000000"/>
         </w:tblBorders>
+        <w:tblLayout w:type="fixed"/>
         <w:tblLook w:val="04A0" w:firstRow="1" w:lastRow="0" w:firstColumn="1" w:lastColumn="0" w:noHBand="0" w:noVBand="1"/>
       </w:tblPr>
       <w:tblGrid>
-        <w:gridCol w:w="4535"/>
-        <w:gridCol w:w="4535"/>
+        <w:gridCol w:w="3743"/>
+        <w:gridCol w:w="2808"/>
+        <w:gridCol w:w="2808"/>
       </w:tblGrid>
       <w:tr>
         <w:trPr>
@@ -3707,7 +3709,7 @@
         </w:trPr>
         <w:tc>
           <w:tcPr>
-            <w:tcW w:w="4535" w:type="dxa"/>
+            <w:tcW w:w="2000" w:type="pct"/>
           </w:tcPr>
           <w:p>
             <w:pPr>
@@ -3727,7 +3729,7 @@
         </w:tc>
         <w:tc>
           <w:tcPr>
-            <w:tcW w:w="4535" w:type="dxa"/>
+            <w:tcW w:w="1500" w:type="pct"/>
           </w:tcPr>
           <w:p>
             <w:pPr>
@@ -3741,7 +3743,28 @@
                 <w:b/>
                 <w:lang w:val="en-US"/>
               </w:rPr>
-              <w:t>Value</w:t>
+              <w:t>Backend</w:t>
+            </w:r>
+          </w:p>
+        </w:tc>
+        <w:tc>
+          <w:tcPr>
+            <w:tcW w:w="1500" w:type="pct"/>
+          </w:tcPr>
+          <w:p>
+            <w:pPr>
+              <w:pStyle w:val="APACelda"/>
+              <w:rPr>
+                <w:b/>
+                <w:lang w:val="en-US"/>
+              </w:rPr>
+            </w:pPr>
+            <w:r>
+              <w:rPr>
+                <w:b/>
+                <w:lang w:val="en-US"/>
+              </w:rPr>
+              <w:t>Frontend</w:t>
             </w:r>
           </w:p>
         </w:tc>
@@ -3753,7 +3776,7 @@
         </w:trPr>
         <w:tc>
           <w:tcPr>
-            <w:tcW w:w="4535" w:type="dxa"/>
+            <w:tcW w:w="2000" w:type="pct"/>
           </w:tcPr>
           <w:p>
             <w:pPr>
@@ -3772,20 +3795,39 @@
         </w:tc>
         <w:tc>
           <w:tcPr>
-            <w:tcW w:w="4535" w:type="dxa"/>
-          </w:tcPr>
-          <w:p>
-            <w:pPr>
-              <w:pStyle w:val="APACelda"/>
-              <w:rPr>
-                <w:lang w:val="en-US"/>
-              </w:rPr>
-            </w:pPr>
-            <w:r>
-              <w:rPr>
-                <w:lang w:val="en-US"/>
-              </w:rPr>
-              <w:t>494</w:t>
+            <w:tcW w:w="1500" w:type="pct"/>
+          </w:tcPr>
+          <w:p>
+            <w:pPr>
+              <w:pStyle w:val="APACelda"/>
+              <w:rPr>
+                <w:lang w:val="en-US"/>
+              </w:rPr>
+            </w:pPr>
+            <w:r>
+              <w:rPr>
+                <w:lang w:val="en-US"/>
+              </w:rPr>
+              <w:t>683</w:t>
+            </w:r>
+          </w:p>
+        </w:tc>
+        <w:tc>
+          <w:tcPr>
+            <w:tcW w:w="1500" w:type="pct"/>
+          </w:tcPr>
+          <w:p>
+            <w:pPr>
+              <w:pStyle w:val="APACelda"/>
+              <w:rPr>
+                <w:lang w:val="en-US"/>
+              </w:rPr>
+            </w:pPr>
+            <w:r>
+              <w:rPr>
+                <w:lang w:val="en-US"/>
+              </w:rPr>
+              <w:t>79</w:t>
             </w:r>
           </w:p>
         </w:tc>
@@ -3797,7 +3839,7 @@
         </w:trPr>
         <w:tc>
           <w:tcPr>
-            <w:tcW w:w="4535" w:type="dxa"/>
+            <w:tcW w:w="2000" w:type="pct"/>
           </w:tcPr>
           <w:p>
             <w:pPr>
@@ -3816,20 +3858,39 @@
         </w:tc>
         <w:tc>
           <w:tcPr>
-            <w:tcW w:w="4535" w:type="dxa"/>
-          </w:tcPr>
-          <w:p>
-            <w:pPr>
-              <w:pStyle w:val="APACelda"/>
-              <w:rPr>
-                <w:lang w:val="en-US"/>
-              </w:rPr>
-            </w:pPr>
-            <w:r>
-              <w:rPr>
-                <w:lang w:val="en-US"/>
-              </w:rPr>
-              <w:t>115</w:t>
+            <w:tcW w:w="1500" w:type="pct"/>
+          </w:tcPr>
+          <w:p>
+            <w:pPr>
+              <w:pStyle w:val="APACelda"/>
+              <w:rPr>
+                <w:lang w:val="en-US"/>
+              </w:rPr>
+            </w:pPr>
+            <w:r>
+              <w:rPr>
+                <w:lang w:val="en-US"/>
+              </w:rPr>
+              <w:t>141</w:t>
+            </w:r>
+          </w:p>
+        </w:tc>
+        <w:tc>
+          <w:tcPr>
+            <w:tcW w:w="1500" w:type="pct"/>
+          </w:tcPr>
+          <w:p>
+            <w:pPr>
+              <w:pStyle w:val="APACelda"/>
+              <w:rPr>
+                <w:lang w:val="en-US"/>
+              </w:rPr>
+            </w:pPr>
+            <w:r>
+              <w:rPr>
+                <w:lang w:val="en-US"/>
+              </w:rPr>
+              <w:t>8</w:t>
             </w:r>
           </w:p>
         </w:tc>
@@ -3841,7 +3902,7 @@
         </w:trPr>
         <w:tc>
           <w:tcPr>
-            <w:tcW w:w="4535" w:type="dxa"/>
+            <w:tcW w:w="2000" w:type="pct"/>
           </w:tcPr>
           <w:p>
             <w:pPr>
@@ -3860,20 +3921,39 @@
         </w:tc>
         <w:tc>
           <w:tcPr>
-            <w:tcW w:w="4535" w:type="dxa"/>
-          </w:tcPr>
-          <w:p>
-            <w:pPr>
-              <w:pStyle w:val="APACelda"/>
-              <w:rPr>
-                <w:lang w:val="en-US"/>
-              </w:rPr>
-            </w:pPr>
-            <w:r>
-              <w:rPr>
-                <w:lang w:val="en-US"/>
-              </w:rPr>
-              <w:t>494</w:t>
+            <w:tcW w:w="1500" w:type="pct"/>
+          </w:tcPr>
+          <w:p>
+            <w:pPr>
+              <w:pStyle w:val="APACelda"/>
+              <w:rPr>
+                <w:lang w:val="en-US"/>
+              </w:rPr>
+            </w:pPr>
+            <w:r>
+              <w:rPr>
+                <w:lang w:val="en-US"/>
+              </w:rPr>
+              <w:t>681</w:t>
+            </w:r>
+          </w:p>
+        </w:tc>
+        <w:tc>
+          <w:tcPr>
+            <w:tcW w:w="1500" w:type="pct"/>
+          </w:tcPr>
+          <w:p>
+            <w:pPr>
+              <w:pStyle w:val="APACelda"/>
+              <w:rPr>
+                <w:lang w:val="en-US"/>
+              </w:rPr>
+            </w:pPr>
+            <w:r>
+              <w:rPr>
+                <w:lang w:val="en-US"/>
+              </w:rPr>
+              <w:t>79</w:t>
             </w:r>
           </w:p>
         </w:tc>
@@ -3885,7 +3965,7 @@
         </w:trPr>
         <w:tc>
           <w:tcPr>
-            <w:tcW w:w="4535" w:type="dxa"/>
+            <w:tcW w:w="2000" w:type="pct"/>
           </w:tcPr>
           <w:p>
             <w:pPr>
@@ -3904,7 +3984,26 @@
         </w:tc>
         <w:tc>
           <w:tcPr>
-            <w:tcW w:w="4535" w:type="dxa"/>
+            <w:tcW w:w="1500" w:type="pct"/>
+          </w:tcPr>
+          <w:p>
+            <w:pPr>
+              <w:pStyle w:val="APACelda"/>
+              <w:rPr>
+                <w:lang w:val="en-US"/>
+              </w:rPr>
+            </w:pPr>
+            <w:r>
+              <w:rPr>
+                <w:lang w:val="en-US"/>
+              </w:rPr>
+              <w:t>0</w:t>
+            </w:r>
+          </w:p>
+        </w:tc>
+        <w:tc>
+          <w:tcPr>
+            <w:tcW w:w="1500" w:type="pct"/>
           </w:tcPr>
           <w:p>
             <w:pPr>
@@ -3929,7 +4028,7 @@
         </w:trPr>
         <w:tc>
           <w:tcPr>
-            <w:tcW w:w="4535" w:type="dxa"/>
+            <w:tcW w:w="2000" w:type="pct"/>
           </w:tcPr>
           <w:p>
             <w:pPr>
@@ -3948,7 +4047,26 @@
         </w:tc>
         <w:tc>
           <w:tcPr>
-            <w:tcW w:w="4535" w:type="dxa"/>
+            <w:tcW w:w="1500" w:type="pct"/>
+          </w:tcPr>
+          <w:p>
+            <w:pPr>
+              <w:pStyle w:val="APACelda"/>
+              <w:rPr>
+                <w:lang w:val="en-US"/>
+              </w:rPr>
+            </w:pPr>
+            <w:r>
+              <w:rPr>
+                <w:lang w:val="en-US"/>
+              </w:rPr>
+              <w:t>2 / 0</w:t>
+            </w:r>
+          </w:p>
+        </w:tc>
+        <w:tc>
+          <w:tcPr>
+            <w:tcW w:w="1500" w:type="pct"/>
           </w:tcPr>
           <w:p>
             <w:pPr>
@@ -3973,7 +4091,7 @@
         </w:trPr>
         <w:tc>
           <w:tcPr>
-            <w:tcW w:w="4535" w:type="dxa"/>
+            <w:tcW w:w="2000" w:type="pct"/>
           </w:tcPr>
           <w:p>
             <w:pPr>
@@ -3992,20 +4110,39 @@
         </w:tc>
         <w:tc>
           <w:tcPr>
-            <w:tcW w:w="4535" w:type="dxa"/>
-          </w:tcPr>
-          <w:p>
-            <w:pPr>
-              <w:pStyle w:val="APACelda"/>
-              <w:rPr>
-                <w:lang w:val="en-US"/>
-              </w:rPr>
-            </w:pPr>
-            <w:r>
-              <w:rPr>
-                <w:lang w:val="en-US"/>
-              </w:rPr>
-              <w:t>87 seconds</w:t>
+            <w:tcW w:w="1500" w:type="pct"/>
+          </w:tcPr>
+          <w:p>
+            <w:pPr>
+              <w:pStyle w:val="APACelda"/>
+              <w:rPr>
+                <w:lang w:val="en-US"/>
+              </w:rPr>
+            </w:pPr>
+            <w:r>
+              <w:rPr>
+                <w:lang w:val="en-US"/>
+              </w:rPr>
+              <w:t>22 seconds</w:t>
+            </w:r>
+          </w:p>
+        </w:tc>
+        <w:tc>
+          <w:tcPr>
+            <w:tcW w:w="1500" w:type="pct"/>
+          </w:tcPr>
+          <w:p>
+            <w:pPr>
+              <w:pStyle w:val="APACelda"/>
+              <w:rPr>
+                <w:lang w:val="en-US"/>
+              </w:rPr>
+            </w:pPr>
+            <w:r>
+              <w:rPr>
+                <w:lang w:val="en-US"/>
+              </w:rPr>
+              <w:t>3 seconds</w:t>
             </w:r>
           </w:p>
         </w:tc>
@@ -4033,7 +4170,7 @@
           <w:sz w:val="20"/>
           <w:lang w:val="en-US"/>
         </w:rPr>
-        <w:t xml:space="preserve"> Output of “npm test” on branch feat/microservices-split, commit 5a91e66.</w:t>
+        <w:t xml:space="preserve"> Backend: branch develop, commit 2993301; the 2 skipped tests need a test PostgreSQL database (variable PROFILE_TEST_DATABASE_URL). Frontend: branch chore/frontend-unit-tests, commit 6219c0d.</w:t>
       </w:r>
     </w:p>
     <w:p>
@@ -4075,7 +4212,7 @@
     <w:tbl>
       <w:tblPr>
         <w:tblStyle w:val="Tablaconcuadrcula"/>
-        <w:tblW w:w="0" w:type="auto"/>
+        <w:tblW w:w="5005" w:type="pct"/>
         <w:jc w:val="center"/>
         <w:tblInd w:w="0" w:type="dxa"/>
         <w:tblBorders>
@@ -4086,12 +4223,14 @@
           <w:insideH w:val="single" w:sz="4" w:space="0" w:color="000000"/>
           <w:insideV w:val="single" w:sz="4" w:space="0" w:color="000000"/>
         </w:tblBorders>
+        <w:tblLayout w:type="fixed"/>
         <w:tblLook w:val="04A0" w:firstRow="1" w:lastRow="0" w:firstColumn="1" w:lastColumn="0" w:noHBand="0" w:noVBand="1"/>
       </w:tblPr>
       <w:tblGrid>
-        <w:gridCol w:w="1928"/>
-        <w:gridCol w:w="1474"/>
-        <w:gridCol w:w="5669"/>
+        <w:gridCol w:w="1685"/>
+        <w:gridCol w:w="1310"/>
+        <w:gridCol w:w="4867"/>
+        <w:gridCol w:w="1497"/>
       </w:tblGrid>
       <w:tr>
         <w:trPr>
@@ -4101,7 +4240,7 @@
         </w:trPr>
         <w:tc>
           <w:tcPr>
-            <w:tcW w:w="1928" w:type="dxa"/>
+            <w:tcW w:w="900" w:type="pct"/>
           </w:tcPr>
           <w:p>
             <w:pPr>
@@ -4121,7 +4260,7 @@
         </w:tc>
         <w:tc>
           <w:tcPr>
-            <w:tcW w:w="1474" w:type="dxa"/>
+            <w:tcW w:w="700" w:type="pct"/>
           </w:tcPr>
           <w:p>
             <w:pPr>
@@ -4141,7 +4280,7 @@
         </w:tc>
         <w:tc>
           <w:tcPr>
-            <w:tcW w:w="5669" w:type="dxa"/>
+            <w:tcW w:w="2600" w:type="pct"/>
           </w:tcPr>
           <w:p>
             <w:pPr>
@@ -4156,6 +4295,27 @@
                 <w:lang w:val="en-US"/>
               </w:rPr>
               <w:t>Aspects verified</w:t>
+            </w:r>
+          </w:p>
+        </w:tc>
+        <w:tc>
+          <w:tcPr>
+            <w:tcW w:w="800" w:type="pct"/>
+          </w:tcPr>
+          <w:p>
+            <w:pPr>
+              <w:pStyle w:val="APACelda"/>
+              <w:rPr>
+                <w:b/>
+                <w:lang w:val="en-US"/>
+              </w:rPr>
+            </w:pPr>
+            <w:r>
+              <w:rPr>
+                <w:b/>
+                <w:lang w:val="en-US"/>
+              </w:rPr>
+              <w:t>Line coverage</w:t>
             </w:r>
           </w:p>
         </w:tc>
@@ -4167,7 +4327,7 @@
         </w:trPr>
         <w:tc>
           <w:tcPr>
-            <w:tcW w:w="1928" w:type="dxa"/>
+            <w:tcW w:w="900" w:type="pct"/>
           </w:tcPr>
           <w:p>
             <w:pPr>
@@ -4186,7 +4346,7 @@
         </w:tc>
         <w:tc>
           <w:tcPr>
-            <w:tcW w:w="1474" w:type="dxa"/>
+            <w:tcW w:w="700" w:type="pct"/>
           </w:tcPr>
           <w:p>
             <w:pPr>
@@ -4205,7 +4365,7 @@
         </w:tc>
         <w:tc>
           <w:tcPr>
-            <w:tcW w:w="5669" w:type="dxa"/>
+            <w:tcW w:w="2600" w:type="pct"/>
           </w:tcPr>
           <w:p>
             <w:pPr>
@@ -4219,6 +4379,25 @@
                 <w:lang w:val="en-US"/>
               </w:rPr>
               <w:t>JWT provider, authMiddleware, requireRole, requirePermission, error handler, configuration, event validators, exponential retry, in-memory bus, and RabbitMQ</w:t>
+            </w:r>
+          </w:p>
+        </w:tc>
+        <w:tc>
+          <w:tcPr>
+            <w:tcW w:w="800" w:type="pct"/>
+          </w:tcPr>
+          <w:p>
+            <w:pPr>
+              <w:pStyle w:val="APACelda"/>
+              <w:rPr>
+                <w:lang w:val="en-US"/>
+              </w:rPr>
+            </w:pPr>
+            <w:r>
+              <w:rPr>
+                <w:lang w:val="en-US"/>
+              </w:rPr>
+              <w:t>99.5%</w:t>
             </w:r>
           </w:p>
         </w:tc>
@@ -4230,7 +4409,7 @@
         </w:trPr>
         <w:tc>
           <w:tcPr>
-            <w:tcW w:w="1928" w:type="dxa"/>
+            <w:tcW w:w="900" w:type="pct"/>
           </w:tcPr>
           <w:p>
             <w:pPr>
@@ -4249,7 +4428,7 @@
         </w:tc>
         <w:tc>
           <w:tcPr>
-            <w:tcW w:w="1474" w:type="dxa"/>
+            <w:tcW w:w="700" w:type="pct"/>
           </w:tcPr>
           <w:p>
             <w:pPr>
@@ -4268,20 +4447,39 @@
         </w:tc>
         <w:tc>
           <w:tcPr>
-            <w:tcW w:w="5669" w:type="dxa"/>
-          </w:tcPr>
-          <w:p>
-            <w:pPr>
-              <w:pStyle w:val="APACelda"/>
-              <w:rPr>
-                <w:lang w:val="en-US"/>
-              </w:rPr>
-            </w:pPr>
-            <w:r>
-              <w:rPr>
-                <w:lang w:val="en-US"/>
-              </w:rPr>
-              <w:t>Prefix-based routing, CORS with allowlist, configuration, public routes</w:t>
+            <w:tcW w:w="2600" w:type="pct"/>
+          </w:tcPr>
+          <w:p>
+            <w:pPr>
+              <w:pStyle w:val="APACelda"/>
+              <w:rPr>
+                <w:lang w:val="en-US"/>
+              </w:rPr>
+            </w:pPr>
+            <w:r>
+              <w:rPr>
+                <w:lang w:val="en-US"/>
+              </w:rPr>
+              <w:t>Prefix-based routing, CORS with allowlist, configuration, public routes, rate limiting</w:t>
+            </w:r>
+          </w:p>
+        </w:tc>
+        <w:tc>
+          <w:tcPr>
+            <w:tcW w:w="800" w:type="pct"/>
+          </w:tcPr>
+          <w:p>
+            <w:pPr>
+              <w:pStyle w:val="APACelda"/>
+              <w:rPr>
+                <w:lang w:val="en-US"/>
+              </w:rPr>
+            </w:pPr>
+            <w:r>
+              <w:rPr>
+                <w:lang w:val="en-US"/>
+              </w:rPr>
+              <w:t>100%</w:t>
             </w:r>
           </w:p>
         </w:tc>
@@ -4293,7 +4491,7 @@
         </w:trPr>
         <w:tc>
           <w:tcPr>
-            <w:tcW w:w="1928" w:type="dxa"/>
+            <w:tcW w:w="900" w:type="pct"/>
           </w:tcPr>
           <w:p>
             <w:pPr>
@@ -4312,39 +4510,58 @@
         </w:tc>
         <w:tc>
           <w:tcPr>
-            <w:tcW w:w="1474" w:type="dxa"/>
-          </w:tcPr>
-          <w:p>
-            <w:pPr>
-              <w:pStyle w:val="APACelda"/>
-              <w:rPr>
-                <w:lang w:val="en-US"/>
-              </w:rPr>
-            </w:pPr>
-            <w:r>
-              <w:rPr>
-                <w:lang w:val="en-US"/>
-              </w:rPr>
-              <w:t>22</w:t>
-            </w:r>
-          </w:p>
-        </w:tc>
-        <w:tc>
-          <w:tcPr>
-            <w:tcW w:w="5669" w:type="dxa"/>
-          </w:tcPr>
-          <w:p>
-            <w:pPr>
-              <w:pStyle w:val="APACelda"/>
-              <w:rPr>
-                <w:lang w:val="en-US"/>
-              </w:rPr>
-            </w:pPr>
-            <w:r>
-              <w:rPr>
-                <w:lang w:val="en-US"/>
-              </w:rPr>
-              <w:t>Registration with email verification, login according to status, password recovery, JWT with roles and permissions, account change and deletion, email templates</w:t>
+            <w:tcW w:w="700" w:type="pct"/>
+          </w:tcPr>
+          <w:p>
+            <w:pPr>
+              <w:pStyle w:val="APACelda"/>
+              <w:rPr>
+                <w:lang w:val="en-US"/>
+              </w:rPr>
+            </w:pPr>
+            <w:r>
+              <w:rPr>
+                <w:lang w:val="en-US"/>
+              </w:rPr>
+              <w:t>30</w:t>
+            </w:r>
+          </w:p>
+        </w:tc>
+        <w:tc>
+          <w:tcPr>
+            <w:tcW w:w="2600" w:type="pct"/>
+          </w:tcPr>
+          <w:p>
+            <w:pPr>
+              <w:pStyle w:val="APACelda"/>
+              <w:rPr>
+                <w:lang w:val="en-US"/>
+              </w:rPr>
+            </w:pPr>
+            <w:r>
+              <w:rPr>
+                <w:lang w:val="en-US"/>
+              </w:rPr>
+              <w:t>Registration with email verification, login according to status and with Google or Facebook, password recovery, JWT with roles and permissions, account change and deletion (also with an email code), event delivery through an outbox, email templates</w:t>
+            </w:r>
+          </w:p>
+        </w:tc>
+        <w:tc>
+          <w:tcPr>
+            <w:tcW w:w="800" w:type="pct"/>
+          </w:tcPr>
+          <w:p>
+            <w:pPr>
+              <w:pStyle w:val="APACelda"/>
+              <w:rPr>
+                <w:lang w:val="en-US"/>
+              </w:rPr>
+            </w:pPr>
+            <w:r>
+              <w:rPr>
+                <w:lang w:val="en-US"/>
+              </w:rPr>
+              <w:t>89.3%</w:t>
             </w:r>
           </w:p>
         </w:tc>
@@ -4356,7 +4573,7 @@
         </w:trPr>
         <w:tc>
           <w:tcPr>
-            <w:tcW w:w="1928" w:type="dxa"/>
+            <w:tcW w:w="900" w:type="pct"/>
           </w:tcPr>
           <w:p>
             <w:pPr>
@@ -4375,39 +4592,65 @@
         </w:tc>
         <w:tc>
           <w:tcPr>
-            <w:tcW w:w="1474" w:type="dxa"/>
-          </w:tcPr>
-          <w:p>
-            <w:pPr>
-              <w:pStyle w:val="APACelda"/>
-              <w:rPr>
-                <w:lang w:val="en-US"/>
-              </w:rPr>
-            </w:pPr>
-            <w:r>
-              <w:rPr>
-                <w:lang w:val="en-US"/>
-              </w:rPr>
-              <w:t>11</w:t>
-            </w:r>
-          </w:p>
-        </w:tc>
-        <w:tc>
-          <w:tcPr>
-            <w:tcW w:w="5669" w:type="dxa"/>
-          </w:tcPr>
-          <w:p>
-            <w:pPr>
-              <w:pStyle w:val="APACelda"/>
-              <w:rPr>
-                <w:lang w:val="en-US"/>
-              </w:rPr>
-            </w:pPr>
-            <w:r>
-              <w:rPr>
-                <w:lang w:val="en-US"/>
-              </w:rPr>
-              <w:t>Translations, history, sign templates (ADMIN only), samples, and consumption of lexicon events with contract</w:t>
+            <w:tcW w:w="700" w:type="pct"/>
+          </w:tcPr>
+          <w:p>
+            <w:pPr>
+              <w:pStyle w:val="APACelda"/>
+              <w:rPr>
+                <w:lang w:val="en-US"/>
+              </w:rPr>
+            </w:pPr>
+            <w:r>
+              <w:rPr>
+                <w:lang w:val="en-US"/>
+              </w:rPr>
+              <w:t>13</w:t>
+            </w:r>
+          </w:p>
+        </w:tc>
+        <w:tc>
+          <w:tcPr>
+            <w:tcW w:w="2600" w:type="pct"/>
+          </w:tcPr>
+          <w:p>
+            <w:pPr>
+              <w:pStyle w:val="APACelda"/>
+              <w:rPr>
+                <w:lang w:val="en-US"/>
+              </w:rPr>
+            </w:pPr>
+            <w:r>
+              <w:rPr>
+                <w:lang w:val="en-US"/>
+              </w:rPr>
+              <w:t>Translations, history, sign templates (</w:t>
+            </w:r>
+            <w:r>
+              <w:rPr>
+                <w:lang w:val="en-US"/>
+              </w:rPr>
+              <w:lastRenderedPageBreak/>
+              <w:t>ADMIN only), samples, consumption of lexicon events with contract, and rejection of writes from deleted accounts</w:t>
+            </w:r>
+          </w:p>
+        </w:tc>
+        <w:tc>
+          <w:tcPr>
+            <w:tcW w:w="800" w:type="pct"/>
+          </w:tcPr>
+          <w:p>
+            <w:pPr>
+              <w:pStyle w:val="APACelda"/>
+              <w:rPr>
+                <w:lang w:val="en-US"/>
+              </w:rPr>
+            </w:pPr>
+            <w:r>
+              <w:rPr>
+                <w:lang w:val="en-US"/>
+              </w:rPr>
+              <w:t>86.0%</w:t>
             </w:r>
           </w:p>
         </w:tc>
@@ -4419,7 +4662,7 @@
         </w:trPr>
         <w:tc>
           <w:tcPr>
-            <w:tcW w:w="1928" w:type="dxa"/>
+            <w:tcW w:w="900" w:type="pct"/>
           </w:tcPr>
           <w:p>
             <w:pPr>
@@ -4438,26 +4681,26 @@
         </w:tc>
         <w:tc>
           <w:tcPr>
-            <w:tcW w:w="1474" w:type="dxa"/>
-          </w:tcPr>
-          <w:p>
-            <w:pPr>
-              <w:pStyle w:val="APACelda"/>
-              <w:rPr>
-                <w:lang w:val="en-US"/>
-              </w:rPr>
-            </w:pPr>
-            <w:r>
-              <w:rPr>
-                <w:lang w:val="en-US"/>
-              </w:rPr>
-              <w:t>6</w:t>
-            </w:r>
-          </w:p>
-        </w:tc>
-        <w:tc>
-          <w:tcPr>
-            <w:tcW w:w="5669" w:type="dxa"/>
+            <w:tcW w:w="700" w:type="pct"/>
+          </w:tcPr>
+          <w:p>
+            <w:pPr>
+              <w:pStyle w:val="APACelda"/>
+              <w:rPr>
+                <w:lang w:val="en-US"/>
+              </w:rPr>
+            </w:pPr>
+            <w:r>
+              <w:rPr>
+                <w:lang w:val="en-US"/>
+              </w:rPr>
+              <w:t>5</w:t>
+            </w:r>
+          </w:p>
+        </w:tc>
+        <w:tc>
+          <w:tcPr>
+            <w:tcW w:w="2600" w:type="pct"/>
           </w:tcPr>
           <w:p>
             <w:pPr>
@@ -4471,6 +4714,25 @@
                 <w:lang w:val="en-US"/>
               </w:rPr>
               <w:t>Catalog, alphabet, search, categories, publication, and withdrawal of signs</w:t>
+            </w:r>
+          </w:p>
+        </w:tc>
+        <w:tc>
+          <w:tcPr>
+            <w:tcW w:w="800" w:type="pct"/>
+          </w:tcPr>
+          <w:p>
+            <w:pPr>
+              <w:pStyle w:val="APACelda"/>
+              <w:rPr>
+                <w:lang w:val="en-US"/>
+              </w:rPr>
+            </w:pPr>
+            <w:r>
+              <w:rPr>
+                <w:lang w:val="en-US"/>
+              </w:rPr>
+              <w:t>83.5%</w:t>
             </w:r>
           </w:p>
         </w:tc>
@@ -4482,7 +4744,7 @@
         </w:trPr>
         <w:tc>
           <w:tcPr>
-            <w:tcW w:w="1928" w:type="dxa"/>
+            <w:tcW w:w="900" w:type="pct"/>
           </w:tcPr>
           <w:p>
             <w:pPr>
@@ -4501,39 +4763,58 @@
         </w:tc>
         <w:tc>
           <w:tcPr>
-            <w:tcW w:w="1474" w:type="dxa"/>
-          </w:tcPr>
-          <w:p>
-            <w:pPr>
-              <w:pStyle w:val="APACelda"/>
-              <w:rPr>
-                <w:lang w:val="en-US"/>
-              </w:rPr>
-            </w:pPr>
-            <w:r>
-              <w:rPr>
-                <w:lang w:val="en-US"/>
-              </w:rPr>
-              <w:t>4</w:t>
-            </w:r>
-          </w:p>
-        </w:tc>
-        <w:tc>
-          <w:tcPr>
-            <w:tcW w:w="5669" w:type="dxa"/>
-          </w:tcPr>
-          <w:p>
-            <w:pPr>
-              <w:pStyle w:val="APACelda"/>
-              <w:rPr>
-                <w:lang w:val="en-US"/>
-              </w:rPr>
-            </w:pPr>
-            <w:r>
-              <w:rPr>
-                <w:lang w:val="en-US"/>
-              </w:rPr>
-              <w:t>Event logging, reports, and event handlers</w:t>
+            <w:tcW w:w="700" w:type="pct"/>
+          </w:tcPr>
+          <w:p>
+            <w:pPr>
+              <w:pStyle w:val="APACelda"/>
+              <w:rPr>
+                <w:lang w:val="en-US"/>
+              </w:rPr>
+            </w:pPr>
+            <w:r>
+              <w:rPr>
+                <w:lang w:val="en-US"/>
+              </w:rPr>
+              <w:t>6</w:t>
+            </w:r>
+          </w:p>
+        </w:tc>
+        <w:tc>
+          <w:tcPr>
+            <w:tcW w:w="2600" w:type="pct"/>
+          </w:tcPr>
+          <w:p>
+            <w:pPr>
+              <w:pStyle w:val="APACelda"/>
+              <w:rPr>
+                <w:lang w:val="en-US"/>
+              </w:rPr>
+            </w:pPr>
+            <w:r>
+              <w:rPr>
+                <w:lang w:val="en-US"/>
+              </w:rPr>
+              <w:t>Event logging, reports, event handlers, and atomic erasure of an account's data</w:t>
+            </w:r>
+          </w:p>
+        </w:tc>
+        <w:tc>
+          <w:tcPr>
+            <w:tcW w:w="800" w:type="pct"/>
+          </w:tcPr>
+          <w:p>
+            <w:pPr>
+              <w:pStyle w:val="APACelda"/>
+              <w:rPr>
+                <w:lang w:val="en-US"/>
+              </w:rPr>
+            </w:pPr>
+            <w:r>
+              <w:rPr>
+                <w:lang w:val="en-US"/>
+              </w:rPr>
+              <w:t>95.1%</w:t>
             </w:r>
           </w:p>
         </w:tc>
@@ -4545,7 +4826,7 @@
         </w:trPr>
         <w:tc>
           <w:tcPr>
-            <w:tcW w:w="1928" w:type="dxa"/>
+            <w:tcW w:w="900" w:type="pct"/>
           </w:tcPr>
           <w:p>
             <w:pPr>
@@ -4564,39 +4845,140 @@
         </w:tc>
         <w:tc>
           <w:tcPr>
-            <w:tcW w:w="1474" w:type="dxa"/>
-          </w:tcPr>
-          <w:p>
-            <w:pPr>
-              <w:pStyle w:val="APACelda"/>
-              <w:rPr>
-                <w:lang w:val="en-US"/>
-              </w:rPr>
-            </w:pPr>
-            <w:r>
-              <w:rPr>
-                <w:lang w:val="en-US"/>
-              </w:rPr>
-              <w:t>4</w:t>
-            </w:r>
-          </w:p>
-        </w:tc>
-        <w:tc>
-          <w:tcPr>
-            <w:tcW w:w="5669" w:type="dxa"/>
-          </w:tcPr>
-          <w:p>
-            <w:pPr>
-              <w:pStyle w:val="APACelda"/>
-              <w:rPr>
-                <w:lang w:val="en-US"/>
-              </w:rPr>
-            </w:pPr>
-            <w:r>
-              <w:rPr>
-                <w:lang w:val="en-US"/>
-              </w:rPr>
-              <w:t>Profile, preferences, notifications, and achievements</w:t>
+            <w:tcW w:w="700" w:type="pct"/>
+          </w:tcPr>
+          <w:p>
+            <w:pPr>
+              <w:pStyle w:val="APACelda"/>
+              <w:rPr>
+                <w:lang w:val="en-US"/>
+              </w:rPr>
+            </w:pPr>
+            <w:r>
+              <w:rPr>
+                <w:lang w:val="en-US"/>
+              </w:rPr>
+              <w:t>11</w:t>
+            </w:r>
+          </w:p>
+        </w:tc>
+        <w:tc>
+          <w:tcPr>
+            <w:tcW w:w="2600" w:type="pct"/>
+          </w:tcPr>
+          <w:p>
+            <w:pPr>
+              <w:pStyle w:val="APACelda"/>
+              <w:rPr>
+                <w:lang w:val="en-US"/>
+              </w:rPr>
+            </w:pPr>
+            <w:r>
+              <w:rPr>
+                <w:lang w:val="en-US"/>
+              </w:rPr>
+              <w:t>Profile, preferences with permissions and creation of a missing profile, notifications, achievements under concurrent updates, account deletion, and profile recovery</w:t>
+            </w:r>
+          </w:p>
+        </w:tc>
+        <w:tc>
+          <w:tcPr>
+            <w:tcW w:w="800" w:type="pct"/>
+          </w:tcPr>
+          <w:p>
+            <w:pPr>
+              <w:pStyle w:val="APACelda"/>
+              <w:rPr>
+                <w:lang w:val="en-US"/>
+              </w:rPr>
+            </w:pPr>
+            <w:r>
+              <w:rPr>
+                <w:lang w:val="en-US"/>
+              </w:rPr>
+              <w:t>83.5%</w:t>
+            </w:r>
+          </w:p>
+        </w:tc>
+      </w:tr>
+      <w:tr>
+        <w:trPr>
+          <w:cantSplit/>
+          <w:jc w:val="center"/>
+        </w:trPr>
+        <w:tc>
+          <w:tcPr>
+            <w:tcW w:w="900" w:type="pct"/>
+          </w:tcPr>
+          <w:p>
+            <w:pPr>
+              <w:pStyle w:val="APACelda"/>
+              <w:rPr>
+                <w:lang w:val="en-US"/>
+              </w:rPr>
+            </w:pPr>
+            <w:r>
+              <w:rPr>
+                <w:lang w:val="en-US"/>
+              </w:rPr>
+              <w:t>Frontend (client application)</w:t>
+            </w:r>
+          </w:p>
+        </w:tc>
+        <w:tc>
+          <w:tcPr>
+            <w:tcW w:w="700" w:type="pct"/>
+          </w:tcPr>
+          <w:p>
+            <w:pPr>
+              <w:pStyle w:val="APACelda"/>
+              <w:rPr>
+                <w:lang w:val="en-US"/>
+              </w:rPr>
+            </w:pPr>
+            <w:r>
+              <w:rPr>
+                <w:lang w:val="en-US"/>
+              </w:rPr>
+              <w:t>8</w:t>
+            </w:r>
+          </w:p>
+        </w:tc>
+        <w:tc>
+          <w:tcPr>
+            <w:tcW w:w="2600" w:type="pct"/>
+          </w:tcPr>
+          <w:p>
+            <w:pPr>
+              <w:pStyle w:val="APACelda"/>
+              <w:rPr>
+                <w:lang w:val="en-US"/>
+              </w:rPr>
+            </w:pPr>
+            <w:r>
+              <w:rPr>
+                <w:lang w:val="en-US"/>
+              </w:rPr>
+              <w:t>Email and password validation, API client (errors, token sent only to the API, single expired-session notice), confirm-email and password-recovery flows, resend countdown, hand normalization, and KNN classifier</w:t>
+            </w:r>
+          </w:p>
+        </w:tc>
+        <w:tc>
+          <w:tcPr>
+            <w:tcW w:w="800" w:type="pct"/>
+          </w:tcPr>
+          <w:p>
+            <w:pPr>
+              <w:pStyle w:val="APACelda"/>
+              <w:rPr>
+                <w:lang w:val="en-US"/>
+              </w:rPr>
+            </w:pPr>
+            <w:r>
+              <w:rPr>
+                <w:lang w:val="en-US"/>
+              </w:rPr>
+              <w:t>4.5%</w:t>
             </w:r>
           </w:p>
         </w:tc>
@@ -4604,6 +4986,31 @@
     </w:tbl>
     <w:p>
       <w:pPr>
+        <w:pStyle w:val="APATexto"/>
+        <w:spacing w:before="80" w:after="200" w:line="240" w:lineRule="auto"/>
+        <w:ind w:firstLine="0"/>
+        <w:rPr>
+          <w:lang w:val="en-US"/>
+        </w:rPr>
+      </w:pPr>
+      <w:r>
+        <w:rPr>
+          <w:i/>
+          <w:sz w:val="20"/>
+          <w:lang w:val="en-US"/>
+        </w:rPr>
+        <w:t>Note.</w:t>
+      </w:r>
+      <w:r>
+        <w:rPr>
+          <w:sz w:val="20"/>
+          <w:lang w:val="en-US"/>
+        </w:rPr>
+        <w:t xml:space="preserve"> Line coverage measured on October 16, 2026 with the built-in node:test coverage in the backend (88.5% in total) and with “jest --coverage” in the frontend. In the frontend only the logic is tested; the screens have no tests yet.</w:t>
+      </w:r>
+    </w:p>
+    <w:p>
+      <w:pPr>
         <w:spacing w:after="80"/>
         <w:rPr>
           <w:lang w:val="en-US"/>
@@ -4617,7 +5024,7 @@
           <w:lang w:val="en-US"/>
         </w:rPr>
       </w:pPr>
-      <w:bookmarkStart w:id="10" w:name="_Toc242459462"/>
+      <w:bookmarkStart w:id="10" w:name="_Toc243049500"/>
       <w:r>
         <w:rPr>
           <w:lang w:val="en-US"/>
@@ -4637,14 +5044,7 @@
         <w:rPr>
           <w:lang w:val="en-US"/>
         </w:rPr>
-        <w:t xml:space="preserve">The following cases verify the critical requirements. The “Passed” status indicates that </w:t>
-      </w:r>
-      <w:r>
-        <w:rPr>
-          <w:lang w:val="en-US"/>
-        </w:rPr>
-        <w:lastRenderedPageBreak/>
-        <w:t>the case was executed successfully; “Pending” indicates that it has not yet been executed in the corresponding environment.</w:t>
+        <w:t>The following cases verify the critical requirements. The “Passed” status indicates that the case was executed successfully; “Pending” indicates that it has not yet been executed in the corresponding environment.</w:t>
       </w:r>
     </w:p>
     <w:p>
@@ -6414,6 +6814,7 @@
               <w:rPr>
                 <w:lang w:val="en-US"/>
               </w:rPr>
+              <w:lastRenderedPageBreak/>
               <w:t>CP-14</w:t>
             </w:r>
           </w:p>
@@ -6770,7 +7171,6 @@
           <w:sz w:val="20"/>
           <w:lang w:val="en-US"/>
         </w:rPr>
-        <w:lastRenderedPageBreak/>
         <w:t>Note.</w:t>
       </w:r>
       <w:r>
@@ -6788,7 +7188,7 @@
           <w:lang w:val="en-US"/>
         </w:rPr>
       </w:pPr>
-      <w:bookmarkStart w:id="11" w:name="_Toc242459463"/>
+      <w:bookmarkStart w:id="11" w:name="_Toc243049501"/>
       <w:r>
         <w:rPr>
           <w:lang w:val="en-US"/>
@@ -7532,7 +7932,7 @@
           <w:lang w:val="en-US"/>
         </w:rPr>
       </w:pPr>
-      <w:bookmarkStart w:id="12" w:name="_Toc242459464"/>
+      <w:bookmarkStart w:id="12" w:name="_Toc243049502"/>
       <w:r>
         <w:rPr>
           <w:lang w:val="en-US"/>
@@ -7576,12 +7976,11 @@
           <w:lang w:val="en-US"/>
         </w:rPr>
       </w:pPr>
-      <w:bookmarkStart w:id="13" w:name="_Toc242459465"/>
+      <w:bookmarkStart w:id="13" w:name="_Toc243049503"/>
       <w:r>
         <w:rPr>
           <w:lang w:val="en-US"/>
         </w:rPr>
-        <w:lastRenderedPageBreak/>
         <w:t>Defects found</w:t>
       </w:r>
       <w:bookmarkEnd w:id="13"/>
@@ -7625,7 +8024,7 @@
     <w:tbl>
       <w:tblPr>
         <w:tblStyle w:val="Tablaconcuadrcula"/>
-        <w:tblW w:w="0" w:type="auto"/>
+        <w:tblW w:w="5000" w:type="pct"/>
         <w:jc w:val="center"/>
         <w:tblInd w:w="0" w:type="dxa"/>
         <w:tblBorders>
@@ -7636,13 +8035,14 @@
           <w:insideH w:val="single" w:sz="4" w:space="0" w:color="000000"/>
           <w:insideV w:val="single" w:sz="4" w:space="0" w:color="000000"/>
         </w:tblBorders>
+        <w:tblLayout w:type="fixed"/>
         <w:tblLook w:val="04A0" w:firstRow="1" w:lastRow="0" w:firstColumn="1" w:lastColumn="0" w:noHBand="0" w:noVBand="1"/>
       </w:tblPr>
       <w:tblGrid>
-        <w:gridCol w:w="907"/>
-        <w:gridCol w:w="4989"/>
-        <w:gridCol w:w="1474"/>
-        <w:gridCol w:w="1701"/>
+        <w:gridCol w:w="935"/>
+        <w:gridCol w:w="3927"/>
+        <w:gridCol w:w="1309"/>
+        <w:gridCol w:w="3179"/>
       </w:tblGrid>
       <w:tr>
         <w:trPr>
@@ -7652,7 +8052,7 @@
         </w:trPr>
         <w:tc>
           <w:tcPr>
-            <w:tcW w:w="907" w:type="dxa"/>
+            <w:tcW w:w="500" w:type="pct"/>
           </w:tcPr>
           <w:p>
             <w:pPr>
@@ -7672,7 +8072,7 @@
         </w:tc>
         <w:tc>
           <w:tcPr>
-            <w:tcW w:w="4989" w:type="dxa"/>
+            <w:tcW w:w="2100" w:type="pct"/>
           </w:tcPr>
           <w:p>
             <w:pPr>
@@ -7692,7 +8092,7 @@
         </w:tc>
         <w:tc>
           <w:tcPr>
-            <w:tcW w:w="1474" w:type="dxa"/>
+            <w:tcW w:w="700" w:type="pct"/>
           </w:tcPr>
           <w:p>
             <w:pPr>
@@ -7712,7 +8112,7 @@
         </w:tc>
         <w:tc>
           <w:tcPr>
-            <w:tcW w:w="1701" w:type="dxa"/>
+            <w:tcW w:w="1700" w:type="pct"/>
           </w:tcPr>
           <w:p>
             <w:pPr>
@@ -7738,7 +8138,7 @@
         </w:trPr>
         <w:tc>
           <w:tcPr>
-            <w:tcW w:w="907" w:type="dxa"/>
+            <w:tcW w:w="500" w:type="pct"/>
           </w:tcPr>
           <w:p>
             <w:pPr>
@@ -7757,7 +8157,7 @@
         </w:tc>
         <w:tc>
           <w:tcPr>
-            <w:tcW w:w="4989" w:type="dxa"/>
+            <w:tcW w:w="2100" w:type="pct"/>
           </w:tcPr>
           <w:p>
             <w:pPr>
@@ -7776,7 +8176,7 @@
         </w:tc>
         <w:tc>
           <w:tcPr>
-            <w:tcW w:w="1474" w:type="dxa"/>
+            <w:tcW w:w="700" w:type="pct"/>
           </w:tcPr>
           <w:p>
             <w:pPr>
@@ -7795,7 +8195,7 @@
         </w:tc>
         <w:tc>
           <w:tcPr>
-            <w:tcW w:w="1701" w:type="dxa"/>
+            <w:tcW w:w="1700" w:type="pct"/>
           </w:tcPr>
           <w:p>
             <w:pPr>
@@ -7820,7 +8220,7 @@
         </w:trPr>
         <w:tc>
           <w:tcPr>
-            <w:tcW w:w="907" w:type="dxa"/>
+            <w:tcW w:w="500" w:type="pct"/>
           </w:tcPr>
           <w:p>
             <w:pPr>
@@ -7839,7 +8239,7 @@
         </w:tc>
         <w:tc>
           <w:tcPr>
-            <w:tcW w:w="4989" w:type="dxa"/>
+            <w:tcW w:w="2100" w:type="pct"/>
           </w:tcPr>
           <w:p>
             <w:pPr>
@@ -7858,7 +8258,7 @@
         </w:tc>
         <w:tc>
           <w:tcPr>
-            <w:tcW w:w="1474" w:type="dxa"/>
+            <w:tcW w:w="700" w:type="pct"/>
           </w:tcPr>
           <w:p>
             <w:pPr>
@@ -7877,7 +8277,7 @@
         </w:tc>
         <w:tc>
           <w:tcPr>
-            <w:tcW w:w="1701" w:type="dxa"/>
+            <w:tcW w:w="1700" w:type="pct"/>
           </w:tcPr>
           <w:p>
             <w:pPr>
@@ -7902,7 +8302,7 @@
         </w:trPr>
         <w:tc>
           <w:tcPr>
-            <w:tcW w:w="907" w:type="dxa"/>
+            <w:tcW w:w="500" w:type="pct"/>
           </w:tcPr>
           <w:p>
             <w:pPr>
@@ -7921,7 +8321,7 @@
         </w:tc>
         <w:tc>
           <w:tcPr>
-            <w:tcW w:w="4989" w:type="dxa"/>
+            <w:tcW w:w="2100" w:type="pct"/>
           </w:tcPr>
           <w:p>
             <w:pPr>
@@ -7940,7 +8340,7 @@
         </w:tc>
         <w:tc>
           <w:tcPr>
-            <w:tcW w:w="1474" w:type="dxa"/>
+            <w:tcW w:w="700" w:type="pct"/>
           </w:tcPr>
           <w:p>
             <w:pPr>
@@ -7959,7 +8359,7 @@
         </w:tc>
         <w:tc>
           <w:tcPr>
-            <w:tcW w:w="1701" w:type="dxa"/>
+            <w:tcW w:w="1700" w:type="pct"/>
           </w:tcPr>
           <w:p>
             <w:pPr>
@@ -7984,7 +8384,7 @@
         </w:trPr>
         <w:tc>
           <w:tcPr>
-            <w:tcW w:w="907" w:type="dxa"/>
+            <w:tcW w:w="500" w:type="pct"/>
           </w:tcPr>
           <w:p>
             <w:pPr>
@@ -8003,7 +8403,7 @@
         </w:tc>
         <w:tc>
           <w:tcPr>
-            <w:tcW w:w="4989" w:type="dxa"/>
+            <w:tcW w:w="2100" w:type="pct"/>
           </w:tcPr>
           <w:p>
             <w:pPr>
@@ -8022,7 +8422,7 @@
         </w:tc>
         <w:tc>
           <w:tcPr>
-            <w:tcW w:w="1474" w:type="dxa"/>
+            <w:tcW w:w="700" w:type="pct"/>
           </w:tcPr>
           <w:p>
             <w:pPr>
@@ -8041,20 +8441,20 @@
         </w:tc>
         <w:tc>
           <w:tcPr>
-            <w:tcW w:w="1701" w:type="dxa"/>
-          </w:tcPr>
-          <w:p>
-            <w:pPr>
-              <w:pStyle w:val="APACelda"/>
-              <w:rPr>
-                <w:lang w:val="en-US"/>
-              </w:rPr>
-            </w:pPr>
-            <w:r>
-              <w:rPr>
-                <w:lang w:val="en-US"/>
-              </w:rPr>
-              <w:t>In verification</w:t>
+            <w:tcW w:w="1700" w:type="pct"/>
+          </w:tcPr>
+          <w:p>
+            <w:pPr>
+              <w:pStyle w:val="APACelda"/>
+              <w:rPr>
+                <w:lang w:val="en-US"/>
+              </w:rPr>
+            </w:pPr>
+            <w:r>
+              <w:rPr>
+                <w:lang w:val="en-US"/>
+              </w:rPr>
+              <w:t>Mitigated: a missing profile is created when preferences are saved and there is a recovery procedure; the query still returns 404 while it is missing</w:t>
             </w:r>
           </w:p>
         </w:tc>
@@ -8066,7 +8466,7 @@
         </w:trPr>
         <w:tc>
           <w:tcPr>
-            <w:tcW w:w="907" w:type="dxa"/>
+            <w:tcW w:w="500" w:type="pct"/>
           </w:tcPr>
           <w:p>
             <w:pPr>
@@ -8085,7 +8485,7 @@
         </w:tc>
         <w:tc>
           <w:tcPr>
-            <w:tcW w:w="4989" w:type="dxa"/>
+            <w:tcW w:w="2100" w:type="pct"/>
           </w:tcPr>
           <w:p>
             <w:pPr>
@@ -8104,7 +8504,7 @@
         </w:tc>
         <w:tc>
           <w:tcPr>
-            <w:tcW w:w="1474" w:type="dxa"/>
+            <w:tcW w:w="700" w:type="pct"/>
           </w:tcPr>
           <w:p>
             <w:pPr>
@@ -8123,20 +8523,266 @@
         </w:tc>
         <w:tc>
           <w:tcPr>
-            <w:tcW w:w="1701" w:type="dxa"/>
-          </w:tcPr>
-          <w:p>
-            <w:pPr>
-              <w:pStyle w:val="APACelda"/>
-              <w:rPr>
-                <w:lang w:val="en-US"/>
-              </w:rPr>
-            </w:pPr>
-            <w:r>
-              <w:rPr>
-                <w:lang w:val="en-US"/>
-              </w:rPr>
-              <w:t>Fixed: the current suite has 494 of 494 passing</w:t>
+            <w:tcW w:w="1700" w:type="pct"/>
+          </w:tcPr>
+          <w:p>
+            <w:pPr>
+              <w:pStyle w:val="APACelda"/>
+              <w:rPr>
+                <w:lang w:val="en-US"/>
+              </w:rPr>
+            </w:pPr>
+            <w:r>
+              <w:rPr>
+                <w:lang w:val="en-US"/>
+              </w:rPr>
+              <w:t>Fixed: the test passes in the current suite</w:t>
+            </w:r>
+          </w:p>
+        </w:tc>
+      </w:tr>
+      <w:tr>
+        <w:trPr>
+          <w:cantSplit/>
+          <w:jc w:val="center"/>
+        </w:trPr>
+        <w:tc>
+          <w:tcPr>
+            <w:tcW w:w="500" w:type="pct"/>
+          </w:tcPr>
+          <w:p>
+            <w:pPr>
+              <w:pStyle w:val="APACelda"/>
+              <w:rPr>
+                <w:lang w:val="en-US"/>
+              </w:rPr>
+            </w:pPr>
+            <w:r>
+              <w:rPr>
+                <w:lang w:val="en-US"/>
+              </w:rPr>
+              <w:t>DEF-06</w:t>
+            </w:r>
+          </w:p>
+        </w:tc>
+        <w:tc>
+          <w:tcPr>
+            <w:tcW w:w="2100" w:type="pct"/>
+          </w:tcPr>
+          <w:p>
+            <w:pPr>
+              <w:pStyle w:val="APACelda"/>
+              <w:rPr>
+                <w:lang w:val="en-US"/>
+              </w:rPr>
+            </w:pPr>
+            <w:r>
+              <w:rPr>
+                <w:lang w:val="en-US"/>
+              </w:rPr>
+              <w:t>The letter L is never recognized: its hand shape matches the D or G rule first</w:t>
+            </w:r>
+          </w:p>
+        </w:tc>
+        <w:tc>
+          <w:tcPr>
+            <w:tcW w:w="700" w:type="pct"/>
+          </w:tcPr>
+          <w:p>
+            <w:pPr>
+              <w:pStyle w:val="APACelda"/>
+              <w:rPr>
+                <w:lang w:val="en-US"/>
+              </w:rPr>
+            </w:pPr>
+            <w:r>
+              <w:rPr>
+                <w:lang w:val="en-US"/>
+              </w:rPr>
+              <w:t>Medium</w:t>
+            </w:r>
+          </w:p>
+        </w:tc>
+        <w:tc>
+          <w:tcPr>
+            <w:tcW w:w="1700" w:type="pct"/>
+          </w:tcPr>
+          <w:p>
+            <w:pPr>
+              <w:pStyle w:val="APACelda"/>
+              <w:rPr>
+                <w:lang w:val="en-US"/>
+              </w:rPr>
+            </w:pPr>
+            <w:r>
+              <w:rPr>
+                <w:lang w:val="en-US"/>
+              </w:rPr>
+              <w:t>Open (found by the frontend unit tests)</w:t>
+            </w:r>
+          </w:p>
+        </w:tc>
+      </w:tr>
+      <w:tr>
+        <w:trPr>
+          <w:cantSplit/>
+          <w:jc w:val="center"/>
+        </w:trPr>
+        <w:tc>
+          <w:tcPr>
+            <w:tcW w:w="500" w:type="pct"/>
+          </w:tcPr>
+          <w:p>
+            <w:pPr>
+              <w:pStyle w:val="APACelda"/>
+              <w:rPr>
+                <w:lang w:val="en-US"/>
+              </w:rPr>
+            </w:pPr>
+            <w:r>
+              <w:rPr>
+                <w:lang w:val="en-US"/>
+              </w:rPr>
+              <w:t>DEF-07</w:t>
+            </w:r>
+          </w:p>
+        </w:tc>
+        <w:tc>
+          <w:tcPr>
+            <w:tcW w:w="2100" w:type="pct"/>
+          </w:tcPr>
+          <w:p>
+            <w:pPr>
+              <w:pStyle w:val="APACelda"/>
+              <w:rPr>
+                <w:lang w:val="en-US"/>
+              </w:rPr>
+            </w:pPr>
+            <w:r>
+              <w:rPr>
+                <w:lang w:val="en-US"/>
+              </w:rPr>
+              <w:t>Two iam-service migrations with the same number (010) when integrating account deletion</w:t>
+            </w:r>
+          </w:p>
+        </w:tc>
+        <w:tc>
+          <w:tcPr>
+            <w:tcW w:w="700" w:type="pct"/>
+          </w:tcPr>
+          <w:p>
+            <w:pPr>
+              <w:pStyle w:val="APACelda"/>
+              <w:rPr>
+                <w:lang w:val="en-US"/>
+              </w:rPr>
+            </w:pPr>
+            <w:r>
+              <w:rPr>
+                <w:lang w:val="en-US"/>
+              </w:rPr>
+              <w:t>Medium</w:t>
+            </w:r>
+          </w:p>
+        </w:tc>
+        <w:tc>
+          <w:tcPr>
+            <w:tcW w:w="1700" w:type="pct"/>
+          </w:tcPr>
+          <w:p>
+            <w:pPr>
+              <w:pStyle w:val="APACelda"/>
+              <w:rPr>
+                <w:lang w:val="en-US"/>
+              </w:rPr>
+            </w:pPr>
+            <w:r>
+              <w:rPr>
+                <w:lang w:val="en-US"/>
+              </w:rPr>
+              <w:t>Fixed: renumbered to 012 before deployment</w:t>
+            </w:r>
+          </w:p>
+        </w:tc>
+      </w:tr>
+      <w:tr>
+        <w:trPr>
+          <w:cantSplit/>
+          <w:jc w:val="center"/>
+        </w:trPr>
+        <w:tc>
+          <w:tcPr>
+            <w:tcW w:w="500" w:type="pct"/>
+          </w:tcPr>
+          <w:p>
+            <w:pPr>
+              <w:pStyle w:val="APACelda"/>
+              <w:rPr>
+                <w:lang w:val="en-US"/>
+              </w:rPr>
+            </w:pPr>
+            <w:r>
+              <w:rPr>
+                <w:lang w:val="en-US"/>
+              </w:rPr>
+              <w:t>DEF-08</w:t>
+            </w:r>
+          </w:p>
+        </w:tc>
+        <w:tc>
+          <w:tcPr>
+            <w:tcW w:w="2100" w:type="pct"/>
+          </w:tcPr>
+          <w:p>
+            <w:pPr>
+              <w:pStyle w:val="APACelda"/>
+              <w:rPr>
+                <w:lang w:val="en-US"/>
+              </w:rPr>
+            </w:pPr>
+            <w:r>
+              <w:rPr>
+                <w:lang w:val="en-US"/>
+              </w:rPr>
+              <w:t>A recognition-service test returned 500 because of the new deleted-account guard</w:t>
+            </w:r>
+          </w:p>
+        </w:tc>
+        <w:tc>
+          <w:tcPr>
+            <w:tcW w:w="700" w:type="pct"/>
+          </w:tcPr>
+          <w:p>
+            <w:pPr>
+              <w:pStyle w:val="APACelda"/>
+              <w:rPr>
+                <w:lang w:val="en-US"/>
+              </w:rPr>
+            </w:pPr>
+            <w:r>
+              <w:rPr>
+                <w:lang w:val="en-US"/>
+              </w:rPr>
+              <w:t>Low</w:t>
+            </w:r>
+          </w:p>
+        </w:tc>
+        <w:tc>
+          <w:tcPr>
+            <w:tcW w:w="1700" w:type="pct"/>
+          </w:tcPr>
+          <w:p>
+            <w:pPr>
+              <w:pStyle w:val="APACelda"/>
+              <w:rPr>
+                <w:lang w:val="en-US"/>
+              </w:rPr>
+            </w:pPr>
+            <w:r>
+              <w:rPr>
+                <w:lang w:val="en-US"/>
+              </w:rPr>
+              <w:t>Fixed: the test uses a simulated connection</w:t>
             </w:r>
           </w:p>
         </w:tc>
@@ -8164,7 +8810,7 @@
           <w:sz w:val="20"/>
           <w:lang w:val="en-US"/>
         </w:rPr>
-        <w:t xml:space="preserve"> The defects come from the code and security audit of phase 4 of the microservices migration.</w:t>
+        <w:t xml:space="preserve"> DEF-01 to DEF-05 come from the code and security audit of phase 4 of the microservices migration; DEF-06 to DEF-08 come from the frontend unit tests and the code review of October 16, 2026.</w:t>
       </w:r>
     </w:p>
     <w:p>
@@ -8174,7 +8820,7 @@
           <w:lang w:val="en-US"/>
         </w:rPr>
       </w:pPr>
-      <w:bookmarkStart w:id="14" w:name="_Toc242459466"/>
+      <w:bookmarkStart w:id="14" w:name="_Toc243049504"/>
       <w:r>
         <w:rPr>
           <w:lang w:val="en-US"/>
@@ -8194,7 +8840,7 @@
         <w:rPr>
           <w:lang w:val="en-US"/>
         </w:rPr>
-        <w:t>The backend passes its entire automated suite (494 tests, 0 failures), and the critical end-to-end flows work with all services deployed in Docker. Pending items are the k6 performance tests, the screen reader tests, the measurement of recognition accuracy for the new words, and the pilot test with real users, which are scheduled for the next iteration.</w:t>
+        <w:t>The backend passes its entire automated suite (683 tests: 681 passed, 0 failures, and 2 skipped because they need a test database) with 88.5% line coverage, above the 80% target. The frontend has its first 79 unit tests, all passing, although its coverage is still low (4.5%). The critical end-to-end flows work with all services deployed in Docker. Pending items are continuous integration to run the tests on every change, extending the frontend tests to the screens, the k6 performance tests, the screen reader tests, the measurement of recognition accuracy for the new words, and the pilot test with real users, which are scheduled for the next iteration.</w:t>
       </w:r>
     </w:p>
     <w:p>
@@ -8205,12 +8851,11 @@
           <w:lang w:val="en-US"/>
         </w:rPr>
       </w:pPr>
-      <w:bookmarkStart w:id="15" w:name="_Toc242459467"/>
+      <w:bookmarkStart w:id="15" w:name="_Toc243049505"/>
       <w:r>
         <w:rPr>
           <w:lang w:val="en-US"/>
         </w:rPr>
-        <w:lastRenderedPageBreak/>
         <w:t>References</w:t>
       </w:r>
       <w:bookmarkEnd w:id="15"/>
@@ -11012,7 +11657,7 @@
       <w:lang w:val="es-CO"/>
     </w:rPr>
   </w:style>
-  <w:style w:type="character" w:styleId="Textoennegrita">
+  <w:style w:type="character" w:styleId="Fuerte">
     <w:name w:val="Strong"/>
     <w:basedOn w:val="Fuentedeprrafopredeter"/>
     <w:uiPriority w:val="22"/>

</xml_diff>